<commit_message>
Actualización Guía Aprendizaje 02 - GA2-220501094-AA3-EV01 - EV02
</commit_message>
<xml_diff>
--- a/Guía Aprendizaje 02/GA2-220501094-AA2-EV01/Ficha_Tecnica_SGPR.docx
+++ b/Guía Aprendizaje 02/GA2-220501094-AA2-EV01/Ficha_Tecnica_SGPR.docx
@@ -566,17 +566,8 @@
                 <w:rStyle w:val="Strong"/>
                 <w:rFonts w:asciiTheme="majorHAnsi" w:hAnsiTheme="majorHAnsi" w:cstheme="majorHAnsi"/>
               </w:rPr>
-              <w:t xml:space="preserve">Descripción del </w:t>
+              <w:t>Descripción del Producto</w:t>
             </w:r>
-            <w:proofErr w:type="spellStart"/>
-            <w:r>
-              <w:rPr>
-                <w:rStyle w:val="Strong"/>
-                <w:rFonts w:asciiTheme="majorHAnsi" w:hAnsiTheme="majorHAnsi" w:cstheme="majorHAnsi"/>
-              </w:rPr>
-              <w:t>Producto</w:t>
-            </w:r>
-            <w:proofErr w:type="spellEnd"/>
           </w:p>
         </w:tc>
       </w:tr>
@@ -753,34 +744,14 @@
                 <w:lang w:val="es-CO" w:eastAsia="es-CO"/>
               </w:rPr>
             </w:pPr>
-            <w:proofErr w:type="spellStart"/>
             <w:r>
               <w:rPr>
                 <w:rFonts w:asciiTheme="majorHAnsi" w:hAnsiTheme="majorHAnsi" w:cstheme="majorHAnsi"/>
                 <w:sz w:val="20"/>
                 <w:szCs w:val="20"/>
               </w:rPr>
-              <w:t>Características</w:t>
+              <w:t>Características Principales</w:t>
             </w:r>
-            <w:proofErr w:type="spellEnd"/>
-            <w:r>
-              <w:rPr>
-                <w:rFonts w:asciiTheme="majorHAnsi" w:hAnsiTheme="majorHAnsi" w:cstheme="majorHAnsi"/>
-                <w:sz w:val="20"/>
-                <w:szCs w:val="20"/>
-              </w:rPr>
-              <w:t xml:space="preserve"> </w:t>
-            </w:r>
-            <w:proofErr w:type="spellStart"/>
-            <w:r>
-              <w:rPr>
-                <w:rFonts w:asciiTheme="majorHAnsi" w:hAnsiTheme="majorHAnsi" w:cstheme="majorHAnsi"/>
-                <w:sz w:val="20"/>
-                <w:szCs w:val="20"/>
-              </w:rPr>
-              <w:t>Principales</w:t>
-            </w:r>
-            <w:proofErr w:type="spellEnd"/>
           </w:p>
         </w:tc>
         <w:tc>
@@ -1240,7 +1211,27 @@
                 <w:szCs w:val="20"/>
                 <w:lang w:val="es-CO" w:eastAsia="es-CO"/>
               </w:rPr>
-              <w:t>Sistema operativo Linux o Windows Server, motor de base de datos MySQL o PostgreSQL, Node.js/Java Runtime, servidor Apache/Nginx.</w:t>
+              <w:t xml:space="preserve">Sistema operativo Linux o Windows Server, motor de base de datos MySQL o PostgreSQL, Node.js/Java </w:t>
+            </w:r>
+            <w:proofErr w:type="spellStart"/>
+            <w:r>
+              <w:rPr>
+                <w:rFonts w:asciiTheme="majorHAnsi" w:eastAsia="Times New Roman" w:hAnsiTheme="majorHAnsi" w:cstheme="majorHAnsi"/>
+                <w:sz w:val="20"/>
+                <w:szCs w:val="20"/>
+                <w:lang w:val="es-CO" w:eastAsia="es-CO"/>
+              </w:rPr>
+              <w:t>Runtime</w:t>
+            </w:r>
+            <w:proofErr w:type="spellEnd"/>
+            <w:r>
+              <w:rPr>
+                <w:rFonts w:asciiTheme="majorHAnsi" w:eastAsia="Times New Roman" w:hAnsiTheme="majorHAnsi" w:cstheme="majorHAnsi"/>
+                <w:sz w:val="20"/>
+                <w:szCs w:val="20"/>
+                <w:lang w:val="es-CO" w:eastAsia="es-CO"/>
+              </w:rPr>
+              <w:t>, servidor Apache/Nginx.</w:t>
             </w:r>
           </w:p>
         </w:tc>
@@ -1488,7 +1479,27 @@
                 <w:szCs w:val="20"/>
                 <w:lang w:val="es-CO" w:eastAsia="es-CO"/>
               </w:rPr>
-              <w:t>Acceso Wi-Fi o red local, permisos de usuario válidos.</w:t>
+              <w:t xml:space="preserve">Acceso </w:t>
+            </w:r>
+            <w:proofErr w:type="spellStart"/>
+            <w:r>
+              <w:rPr>
+                <w:rFonts w:asciiTheme="majorHAnsi" w:eastAsia="Times New Roman" w:hAnsiTheme="majorHAnsi" w:cstheme="majorHAnsi"/>
+                <w:sz w:val="20"/>
+                <w:szCs w:val="20"/>
+                <w:lang w:val="es-CO" w:eastAsia="es-CO"/>
+              </w:rPr>
+              <w:t>Wi</w:t>
+            </w:r>
+            <w:proofErr w:type="spellEnd"/>
+            <w:r>
+              <w:rPr>
+                <w:rFonts w:asciiTheme="majorHAnsi" w:eastAsia="Times New Roman" w:hAnsiTheme="majorHAnsi" w:cstheme="majorHAnsi"/>
+                <w:sz w:val="20"/>
+                <w:szCs w:val="20"/>
+                <w:lang w:val="es-CO" w:eastAsia="es-CO"/>
+              </w:rPr>
+              <w:t>-Fi o red local, permisos de usuario válidos.</w:t>
             </w:r>
           </w:p>
         </w:tc>
@@ -1500,147 +1511,6 @@
           <w:lang w:val="es-CO"/>
         </w:rPr>
       </w:pPr>
-      <w:r>
-        <w:rPr>
-          <w:rFonts w:asciiTheme="majorHAnsi" w:eastAsiaTheme="majorEastAsia" w:hAnsiTheme="majorHAnsi" w:cstheme="majorHAnsi"/>
-          <w:b/>
-          <w:bCs/>
-          <w:noProof/>
-          <w:color w:val="4F81BD" w:themeColor="accent1"/>
-          <w:sz w:val="20"/>
-          <w:szCs w:val="20"/>
-          <w:lang w:val="es-CO"/>
-        </w:rPr>
-        <mc:AlternateContent>
-          <mc:Choice Requires="wpg">
-            <w:drawing>
-              <wp:anchor distT="0" distB="0" distL="114300" distR="114300" simplePos="0" relativeHeight="251672576" behindDoc="1" locked="0" layoutInCell="1" allowOverlap="1" wp14:anchorId="71B5D39F" wp14:editId="2D4362FB">
-                <wp:simplePos x="0" y="0"/>
-                <wp:positionH relativeFrom="column">
-                  <wp:posOffset>-1261241</wp:posOffset>
-                </wp:positionH>
-                <wp:positionV relativeFrom="page">
-                  <wp:posOffset>9333685</wp:posOffset>
-                </wp:positionV>
-                <wp:extent cx="8067675" cy="471170"/>
-                <wp:effectExtent l="0" t="0" r="47625" b="100330"/>
-                <wp:wrapNone/>
-                <wp:docPr id="54" name="Group 54"/>
-                <wp:cNvGraphicFramePr/>
-                <a:graphic xmlns:a="http://schemas.openxmlformats.org/drawingml/2006/main">
-                  <a:graphicData uri="http://schemas.microsoft.com/office/word/2010/wordprocessingGroup">
-                    <wpg:wgp>
-                      <wpg:cNvGrpSpPr/>
-                      <wpg:grpSpPr>
-                        <a:xfrm>
-                          <a:off x="0" y="0"/>
-                          <a:ext cx="8067675" cy="471170"/>
-                          <a:chOff x="-57141" y="0"/>
-                          <a:chExt cx="7839061" cy="470137"/>
-                        </a:xfrm>
-                      </wpg:grpSpPr>
-                      <wps:wsp>
-                        <wps:cNvPr id="55" name="Rectangle 55"/>
-                        <wps:cNvSpPr/>
-                        <wps:spPr>
-                          <a:xfrm>
-                            <a:off x="-57141" y="0"/>
-                            <a:ext cx="7839061" cy="298687"/>
-                          </a:xfrm>
-                          <a:prstGeom prst="rect">
-                            <a:avLst/>
-                          </a:prstGeom>
-                          <a:solidFill>
-                            <a:schemeClr val="bg1">
-                              <a:lumMod val="85000"/>
-                            </a:schemeClr>
-                          </a:solidFill>
-                          <a:ln>
-                            <a:noFill/>
-                          </a:ln>
-                        </wps:spPr>
-                        <wps:style>
-                          <a:lnRef idx="2">
-                            <a:schemeClr val="accent1"/>
-                          </a:lnRef>
-                          <a:fillRef idx="1">
-                            <a:schemeClr val="lt1"/>
-                          </a:fillRef>
-                          <a:effectRef idx="0">
-                            <a:schemeClr val="accent1"/>
-                          </a:effectRef>
-                          <a:fontRef idx="minor">
-                            <a:schemeClr val="dk1"/>
-                          </a:fontRef>
-                        </wps:style>
-                        <wps:bodyPr rot="0" spcFirstLastPara="0" vertOverflow="overflow" horzOverflow="overflow" vert="horz" wrap="square" lIns="91440" tIns="45720" rIns="91440" bIns="45720" numCol="1" spcCol="0" rtlCol="0" fromWordArt="0" anchor="ctr" anchorCtr="0" forceAA="0" compatLnSpc="1">
-                          <a:prstTxWarp prst="textNoShape">
-                            <a:avLst/>
-                          </a:prstTxWarp>
-                          <a:noAutofit/>
-                        </wps:bodyPr>
-                      </wps:wsp>
-                      <wps:wsp>
-                        <wps:cNvPr id="56" name="Rectangle 56"/>
-                        <wps:cNvSpPr/>
-                        <wps:spPr>
-                          <a:xfrm>
-                            <a:off x="0" y="171450"/>
-                            <a:ext cx="7762875" cy="298687"/>
-                          </a:xfrm>
-                          <a:prstGeom prst="rect">
-                            <a:avLst/>
-                          </a:prstGeom>
-                          <a:solidFill>
-                            <a:srgbClr val="1649FF"/>
-                          </a:solidFill>
-                        </wps:spPr>
-                        <wps:style>
-                          <a:lnRef idx="1">
-                            <a:schemeClr val="accent1"/>
-                          </a:lnRef>
-                          <a:fillRef idx="3">
-                            <a:schemeClr val="accent1"/>
-                          </a:fillRef>
-                          <a:effectRef idx="2">
-                            <a:schemeClr val="accent1"/>
-                          </a:effectRef>
-                          <a:fontRef idx="minor">
-                            <a:schemeClr val="lt1"/>
-                          </a:fontRef>
-                        </wps:style>
-                        <wps:bodyPr rot="0" spcFirstLastPara="0" vertOverflow="overflow" horzOverflow="overflow" vert="horz" wrap="square" lIns="91440" tIns="45720" rIns="91440" bIns="45720" numCol="1" spcCol="0" rtlCol="0" fromWordArt="0" anchor="ctr" anchorCtr="0" forceAA="0" compatLnSpc="1">
-                          <a:prstTxWarp prst="textNoShape">
-                            <a:avLst/>
-                          </a:prstTxWarp>
-                          <a:noAutofit/>
-                        </wps:bodyPr>
-                      </wps:wsp>
-                    </wpg:wgp>
-                  </a:graphicData>
-                </a:graphic>
-                <wp14:sizeRelH relativeFrom="margin">
-                  <wp14:pctWidth>0</wp14:pctWidth>
-                </wp14:sizeRelH>
-                <wp14:sizeRelV relativeFrom="margin">
-                  <wp14:pctHeight>0</wp14:pctHeight>
-                </wp14:sizeRelV>
-              </wp:anchor>
-            </w:drawing>
-          </mc:Choice>
-          <mc:Fallback>
-            <w:pict>
-              <v:group w14:anchorId="7971D53F" id="Group 54" o:spid="_x0000_s1026" style="position:absolute;margin-left:-99.3pt;margin-top:734.95pt;width:635.25pt;height:37.1pt;z-index:-251643904;mso-position-vertical-relative:page;mso-width-relative:margin;mso-height-relative:margin" coordorigin="-571" coordsize="78390,4701" o:gfxdata="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">
-                <v:rect id="Rectangle 55" o:spid="_x0000_s1027" style="position:absolute;left:-571;width:78390;height:2986;visibility:visible;mso-wrap-style:square;v-text-anchor:middle" o:gfxdata="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" fillcolor="#d8d8d8 [2732]" stroked="f" strokeweight="2pt"/>
-                <v:rect id="Rectangle 56" o:spid="_x0000_s1028" style="position:absolute;top:1714;width:77628;height:2987;visibility:visible;mso-wrap-style:square;v-text-anchor:middle" o:gfxdata="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" fillcolor="#1649ff" strokecolor="#4579b8 [3044]">
-                  <v:shadow on="t" color="black" opacity="22937f" origin=",.5" offset="0,.63889mm"/>
-                </v:rect>
-                <w10:wrap anchory="page"/>
-              </v:group>
-            </w:pict>
-          </mc:Fallback>
-        </mc:AlternateContent>
-      </w:r>
     </w:p>
     <w:p>
       <w:pPr>
@@ -1655,6 +1525,20 @@
           <w:lang w:val="es-CO"/>
         </w:rPr>
       </w:pPr>
+      <w:r>
+        <w:rPr>
+          <w:noProof/>
+        </w:rPr>
+        <w:pict w14:anchorId="4E9243EF">
+          <v:group id="Group 54" o:spid="_x0000_s2056" style="position:absolute;margin-left:-99.3pt;margin-top:752.35pt;width:635.25pt;height:37.1pt;z-index:-251643904;mso-position-vertical-relative:page;mso-width-relative:margin;mso-height-relative:margin" coordorigin="-571" coordsize="78390,4701" o:gfxdata="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">
+            <v:rect id="Rectangle 55" o:spid="_x0000_s2057" style="position:absolute;left:-571;width:78390;height:2986;visibility:visible;mso-wrap-style:square;v-text-anchor:middle" o:gfxdata="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" fillcolor="#d8d8d8 [2732]" stroked="f" strokeweight="2pt"/>
+            <v:rect id="Rectangle 56" o:spid="_x0000_s2058" style="position:absolute;top:1714;width:77628;height:2987;visibility:visible;mso-wrap-style:square;v-text-anchor:middle" o:gfxdata="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" fillcolor="#1649ff" strokecolor="#4579b8 [3044]">
+              <v:shadow on="t" color="black" opacity="22937f" origin=",.5" offset="0,.63889mm"/>
+            </v:rect>
+            <w10:wrap anchory="page"/>
+          </v:group>
+        </w:pict>
+      </w:r>
     </w:p>
     <w:p>
       <w:pPr>
@@ -2369,147 +2253,6 @@
           <w:lang w:val="es-CO"/>
         </w:rPr>
       </w:pPr>
-      <w:r>
-        <w:rPr>
-          <w:rFonts w:asciiTheme="majorHAnsi" w:eastAsiaTheme="majorEastAsia" w:hAnsiTheme="majorHAnsi" w:cstheme="majorHAnsi"/>
-          <w:b/>
-          <w:bCs/>
-          <w:noProof/>
-          <w:color w:val="4F81BD" w:themeColor="accent1"/>
-          <w:sz w:val="20"/>
-          <w:szCs w:val="20"/>
-          <w:lang w:val="es-CO"/>
-        </w:rPr>
-        <mc:AlternateContent>
-          <mc:Choice Requires="wpg">
-            <w:drawing>
-              <wp:anchor distT="0" distB="0" distL="114300" distR="114300" simplePos="0" relativeHeight="251667456" behindDoc="1" locked="0" layoutInCell="1" allowOverlap="1" wp14:anchorId="294A081E" wp14:editId="2D57BE56">
-                <wp:simplePos x="0" y="0"/>
-                <wp:positionH relativeFrom="column">
-                  <wp:posOffset>-1388745</wp:posOffset>
-                </wp:positionH>
-                <wp:positionV relativeFrom="page">
-                  <wp:posOffset>9314815</wp:posOffset>
-                </wp:positionV>
-                <wp:extent cx="8067675" cy="471170"/>
-                <wp:effectExtent l="0" t="0" r="47625" b="100330"/>
-                <wp:wrapNone/>
-                <wp:docPr id="32" name="Group 32"/>
-                <wp:cNvGraphicFramePr/>
-                <a:graphic xmlns:a="http://schemas.openxmlformats.org/drawingml/2006/main">
-                  <a:graphicData uri="http://schemas.microsoft.com/office/word/2010/wordprocessingGroup">
-                    <wpg:wgp>
-                      <wpg:cNvGrpSpPr/>
-                      <wpg:grpSpPr>
-                        <a:xfrm>
-                          <a:off x="0" y="0"/>
-                          <a:ext cx="8067675" cy="471170"/>
-                          <a:chOff x="-57141" y="0"/>
-                          <a:chExt cx="7839061" cy="470137"/>
-                        </a:xfrm>
-                      </wpg:grpSpPr>
-                      <wps:wsp>
-                        <wps:cNvPr id="33" name="Rectangle 33"/>
-                        <wps:cNvSpPr/>
-                        <wps:spPr>
-                          <a:xfrm>
-                            <a:off x="-57141" y="0"/>
-                            <a:ext cx="7839061" cy="298687"/>
-                          </a:xfrm>
-                          <a:prstGeom prst="rect">
-                            <a:avLst/>
-                          </a:prstGeom>
-                          <a:solidFill>
-                            <a:schemeClr val="bg1">
-                              <a:lumMod val="85000"/>
-                            </a:schemeClr>
-                          </a:solidFill>
-                          <a:ln>
-                            <a:noFill/>
-                          </a:ln>
-                        </wps:spPr>
-                        <wps:style>
-                          <a:lnRef idx="2">
-                            <a:schemeClr val="accent1"/>
-                          </a:lnRef>
-                          <a:fillRef idx="1">
-                            <a:schemeClr val="lt1"/>
-                          </a:fillRef>
-                          <a:effectRef idx="0">
-                            <a:schemeClr val="accent1"/>
-                          </a:effectRef>
-                          <a:fontRef idx="minor">
-                            <a:schemeClr val="dk1"/>
-                          </a:fontRef>
-                        </wps:style>
-                        <wps:bodyPr rot="0" spcFirstLastPara="0" vertOverflow="overflow" horzOverflow="overflow" vert="horz" wrap="square" lIns="91440" tIns="45720" rIns="91440" bIns="45720" numCol="1" spcCol="0" rtlCol="0" fromWordArt="0" anchor="ctr" anchorCtr="0" forceAA="0" compatLnSpc="1">
-                          <a:prstTxWarp prst="textNoShape">
-                            <a:avLst/>
-                          </a:prstTxWarp>
-                          <a:noAutofit/>
-                        </wps:bodyPr>
-                      </wps:wsp>
-                      <wps:wsp>
-                        <wps:cNvPr id="34" name="Rectangle 34"/>
-                        <wps:cNvSpPr/>
-                        <wps:spPr>
-                          <a:xfrm>
-                            <a:off x="0" y="171450"/>
-                            <a:ext cx="7762875" cy="298687"/>
-                          </a:xfrm>
-                          <a:prstGeom prst="rect">
-                            <a:avLst/>
-                          </a:prstGeom>
-                          <a:solidFill>
-                            <a:srgbClr val="1649FF"/>
-                          </a:solidFill>
-                        </wps:spPr>
-                        <wps:style>
-                          <a:lnRef idx="1">
-                            <a:schemeClr val="accent1"/>
-                          </a:lnRef>
-                          <a:fillRef idx="3">
-                            <a:schemeClr val="accent1"/>
-                          </a:fillRef>
-                          <a:effectRef idx="2">
-                            <a:schemeClr val="accent1"/>
-                          </a:effectRef>
-                          <a:fontRef idx="minor">
-                            <a:schemeClr val="lt1"/>
-                          </a:fontRef>
-                        </wps:style>
-                        <wps:bodyPr rot="0" spcFirstLastPara="0" vertOverflow="overflow" horzOverflow="overflow" vert="horz" wrap="square" lIns="91440" tIns="45720" rIns="91440" bIns="45720" numCol="1" spcCol="0" rtlCol="0" fromWordArt="0" anchor="ctr" anchorCtr="0" forceAA="0" compatLnSpc="1">
-                          <a:prstTxWarp prst="textNoShape">
-                            <a:avLst/>
-                          </a:prstTxWarp>
-                          <a:noAutofit/>
-                        </wps:bodyPr>
-                      </wps:wsp>
-                    </wpg:wgp>
-                  </a:graphicData>
-                </a:graphic>
-                <wp14:sizeRelH relativeFrom="margin">
-                  <wp14:pctWidth>0</wp14:pctWidth>
-                </wp14:sizeRelH>
-                <wp14:sizeRelV relativeFrom="margin">
-                  <wp14:pctHeight>0</wp14:pctHeight>
-                </wp14:sizeRelV>
-              </wp:anchor>
-            </w:drawing>
-          </mc:Choice>
-          <mc:Fallback>
-            <w:pict>
-              <v:group w14:anchorId="1DCC4D98" id="Group 32" o:spid="_x0000_s1026" style="position:absolute;margin-left:-109.35pt;margin-top:733.45pt;width:635.25pt;height:37.1pt;z-index:-251649024;mso-position-vertical-relative:page;mso-width-relative:margin;mso-height-relative:margin" coordorigin="-571" coordsize="78390,4701" o:gfxdata="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">
-                <v:rect id="Rectangle 33" o:spid="_x0000_s1027" style="position:absolute;left:-571;width:78390;height:2986;visibility:visible;mso-wrap-style:square;v-text-anchor:middle" o:gfxdata="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" fillcolor="#d8d8d8 [2732]" stroked="f" strokeweight="2pt"/>
-                <v:rect id="Rectangle 34" o:spid="_x0000_s1028" style="position:absolute;top:1714;width:77628;height:2987;visibility:visible;mso-wrap-style:square;v-text-anchor:middle" o:gfxdata="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" fillcolor="#1649ff" strokecolor="#4579b8 [3044]">
-                  <v:shadow on="t" color="black" opacity="22937f" origin=",.5" offset="0,.63889mm"/>
-                </v:rect>
-                <w10:wrap anchory="page"/>
-              </v:group>
-            </w:pict>
-          </mc:Fallback>
-        </mc:AlternateContent>
-      </w:r>
     </w:p>
     <w:p>
       <w:pPr>
@@ -2523,6 +2266,20 @@
           <w:lang w:val="es-CO"/>
         </w:rPr>
       </w:pPr>
+      <w:r>
+        <w:rPr>
+          <w:noProof/>
+        </w:rPr>
+        <w:pict w14:anchorId="61C35F26">
+          <v:group id="Group 32" o:spid="_x0000_s2053" style="position:absolute;margin-left:-109.35pt;margin-top:753.25pt;width:635.25pt;height:37.1pt;z-index:-251649024;mso-position-vertical-relative:page;mso-width-relative:margin;mso-height-relative:margin" coordorigin="-571" coordsize="78390,4701" o:gfxdata="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">
+            <v:rect id="Rectangle 33" o:spid="_x0000_s2054" style="position:absolute;left:-571;width:78390;height:2986;visibility:visible;mso-wrap-style:square;v-text-anchor:middle" o:gfxdata="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" fillcolor="#d8d8d8 [2732]" stroked="f" strokeweight="2pt"/>
+            <v:rect id="Rectangle 34" o:spid="_x0000_s2055" style="position:absolute;top:1714;width:77628;height:2987;visibility:visible;mso-wrap-style:square;v-text-anchor:middle" o:gfxdata="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" fillcolor="#1649ff" strokecolor="#4579b8 [3044]">
+              <v:shadow on="t" color="black" opacity="22937f" origin=",.5" offset="0,.63889mm"/>
+            </v:rect>
+            <w10:wrap anchory="page"/>
+          </v:group>
+        </w:pict>
+      </w:r>
     </w:p>
     <w:p>
       <w:pPr>
@@ -2647,21 +2404,12 @@
                 <w:bCs w:val="0"/>
               </w:rPr>
             </w:pPr>
-            <w:proofErr w:type="spellStart"/>
             <w:r>
               <w:rPr>
                 <w:rStyle w:val="Strong"/>
                 <w:rFonts w:asciiTheme="majorHAnsi" w:hAnsiTheme="majorHAnsi" w:cstheme="majorHAnsi"/>
               </w:rPr>
-              <w:t>Métricas</w:t>
-            </w:r>
-            <w:proofErr w:type="spellEnd"/>
-            <w:r>
-              <w:rPr>
-                <w:rStyle w:val="Strong"/>
-                <w:rFonts w:asciiTheme="majorHAnsi" w:hAnsiTheme="majorHAnsi" w:cstheme="majorHAnsi"/>
-              </w:rPr>
-              <w:t xml:space="preserve"> de Calidad</w:t>
+              <w:t>Métricas de Calidad</w:t>
             </w:r>
           </w:p>
         </w:tc>
@@ -2805,7 +2553,27 @@
                 <w:szCs w:val="20"/>
                 <w:lang w:val="es-CO" w:eastAsia="es-CO"/>
               </w:rPr>
-              <w:t>Tiempo de respuesta &lt; 3 seg por acción</w:t>
+              <w:t xml:space="preserve">Tiempo de respuesta &lt; 3 </w:t>
+            </w:r>
+            <w:proofErr w:type="spellStart"/>
+            <w:r>
+              <w:rPr>
+                <w:rFonts w:asciiTheme="majorHAnsi" w:eastAsia="Times New Roman" w:hAnsiTheme="majorHAnsi" w:cstheme="majorHAnsi"/>
+                <w:sz w:val="20"/>
+                <w:szCs w:val="20"/>
+                <w:lang w:val="es-CO" w:eastAsia="es-CO"/>
+              </w:rPr>
+              <w:t>seg</w:t>
+            </w:r>
+            <w:proofErr w:type="spellEnd"/>
+            <w:r>
+              <w:rPr>
+                <w:rFonts w:asciiTheme="majorHAnsi" w:eastAsia="Times New Roman" w:hAnsiTheme="majorHAnsi" w:cstheme="majorHAnsi"/>
+                <w:sz w:val="20"/>
+                <w:szCs w:val="20"/>
+                <w:lang w:val="es-CO" w:eastAsia="es-CO"/>
+              </w:rPr>
+              <w:t xml:space="preserve"> por acción</w:t>
             </w:r>
           </w:p>
         </w:tc>
@@ -3667,6 +3435,7 @@
                 <w:rFonts w:asciiTheme="majorHAnsi" w:hAnsiTheme="majorHAnsi" w:cstheme="majorHAnsi"/>
               </w:rPr>
             </w:pPr>
+            <w:proofErr w:type="spellStart"/>
             <w:r>
               <w:rPr>
                 <w:rStyle w:val="Strong"/>
@@ -3674,6 +3443,7 @@
               </w:rPr>
               <w:t>Elaboró</w:t>
             </w:r>
+            <w:proofErr w:type="spellEnd"/>
           </w:p>
         </w:tc>
         <w:tc>
@@ -3691,6 +3461,7 @@
                 <w:rFonts w:asciiTheme="majorHAnsi" w:hAnsiTheme="majorHAnsi" w:cstheme="majorHAnsi"/>
               </w:rPr>
             </w:pPr>
+            <w:proofErr w:type="spellStart"/>
             <w:r>
               <w:rPr>
                 <w:rStyle w:val="Strong"/>
@@ -3698,6 +3469,7 @@
               </w:rPr>
               <w:t>Aprobó</w:t>
             </w:r>
+            <w:proofErr w:type="spellEnd"/>
           </w:p>
         </w:tc>
         <w:tc>
@@ -3715,6 +3487,7 @@
                 <w:rFonts w:asciiTheme="majorHAnsi" w:hAnsiTheme="majorHAnsi" w:cstheme="majorHAnsi"/>
               </w:rPr>
             </w:pPr>
+            <w:proofErr w:type="spellStart"/>
             <w:r>
               <w:rPr>
                 <w:rStyle w:val="Strong"/>
@@ -3722,6 +3495,7 @@
               </w:rPr>
               <w:t>Validó</w:t>
             </w:r>
+            <w:proofErr w:type="spellEnd"/>
           </w:p>
         </w:tc>
       </w:tr>
@@ -3781,6 +3555,7 @@
                 <w:lang w:val="es-CO" w:eastAsia="es-CO"/>
               </w:rPr>
             </w:pPr>
+            <w:proofErr w:type="spellStart"/>
             <w:r>
               <w:rPr>
                 <w:rFonts w:asciiTheme="majorHAnsi" w:hAnsiTheme="majorHAnsi" w:cstheme="majorHAnsi"/>
@@ -3789,6 +3564,7 @@
               </w:rPr>
               <w:t>Firma</w:t>
             </w:r>
+            <w:proofErr w:type="spellEnd"/>
           </w:p>
         </w:tc>
         <w:tc>
@@ -3847,6 +3623,7 @@
                 <w:lang w:val="es-CO" w:eastAsia="es-CO"/>
               </w:rPr>
             </w:pPr>
+            <w:proofErr w:type="spellStart"/>
             <w:r>
               <w:rPr>
                 <w:rFonts w:asciiTheme="majorHAnsi" w:hAnsiTheme="majorHAnsi" w:cstheme="majorHAnsi"/>
@@ -3855,6 +3632,7 @@
               </w:rPr>
               <w:t>Firma</w:t>
             </w:r>
+            <w:proofErr w:type="spellEnd"/>
           </w:p>
         </w:tc>
         <w:tc>
@@ -3908,6 +3686,7 @@
                 <w:lang w:val="es-CO" w:eastAsia="es-CO"/>
               </w:rPr>
             </w:pPr>
+            <w:proofErr w:type="spellStart"/>
             <w:r>
               <w:rPr>
                 <w:rFonts w:asciiTheme="majorHAnsi" w:hAnsiTheme="majorHAnsi" w:cstheme="majorHAnsi"/>
@@ -3916,6 +3695,7 @@
               </w:rPr>
               <w:t>Firma</w:t>
             </w:r>
+            <w:proofErr w:type="spellEnd"/>
           </w:p>
         </w:tc>
       </w:tr>
@@ -4151,144 +3931,17 @@
       </w:pPr>
       <w:r>
         <w:rPr>
-          <w:rFonts w:asciiTheme="majorHAnsi" w:eastAsiaTheme="majorEastAsia" w:hAnsiTheme="majorHAnsi" w:cstheme="majorHAnsi"/>
-          <w:b/>
-          <w:bCs/>
           <w:noProof/>
-          <w:color w:val="4F81BD" w:themeColor="accent1"/>
-          <w:sz w:val="20"/>
-          <w:szCs w:val="20"/>
-          <w:lang w:val="es-CO"/>
         </w:rPr>
-        <mc:AlternateContent>
-          <mc:Choice Requires="wpg">
-            <w:drawing>
-              <wp:anchor distT="0" distB="0" distL="114300" distR="114300" simplePos="0" relativeHeight="251676672" behindDoc="1" locked="0" layoutInCell="1" allowOverlap="1" wp14:anchorId="56D97FD2" wp14:editId="4105C770">
-                <wp:simplePos x="0" y="0"/>
-                <wp:positionH relativeFrom="column">
-                  <wp:posOffset>-1245476</wp:posOffset>
-                </wp:positionH>
-                <wp:positionV relativeFrom="page">
-                  <wp:posOffset>9310217</wp:posOffset>
-                </wp:positionV>
-                <wp:extent cx="8067675" cy="471170"/>
-                <wp:effectExtent l="0" t="0" r="47625" b="100330"/>
-                <wp:wrapNone/>
-                <wp:docPr id="58" name="Group 58"/>
-                <wp:cNvGraphicFramePr/>
-                <a:graphic xmlns:a="http://schemas.openxmlformats.org/drawingml/2006/main">
-                  <a:graphicData uri="http://schemas.microsoft.com/office/word/2010/wordprocessingGroup">
-                    <wpg:wgp>
-                      <wpg:cNvGrpSpPr/>
-                      <wpg:grpSpPr>
-                        <a:xfrm>
-                          <a:off x="0" y="0"/>
-                          <a:ext cx="8067675" cy="471170"/>
-                          <a:chOff x="-57141" y="0"/>
-                          <a:chExt cx="7839061" cy="470137"/>
-                        </a:xfrm>
-                      </wpg:grpSpPr>
-                      <wps:wsp>
-                        <wps:cNvPr id="59" name="Rectangle 59"/>
-                        <wps:cNvSpPr/>
-                        <wps:spPr>
-                          <a:xfrm>
-                            <a:off x="-57141" y="0"/>
-                            <a:ext cx="7839061" cy="298687"/>
-                          </a:xfrm>
-                          <a:prstGeom prst="rect">
-                            <a:avLst/>
-                          </a:prstGeom>
-                          <a:solidFill>
-                            <a:schemeClr val="bg1">
-                              <a:lumMod val="85000"/>
-                            </a:schemeClr>
-                          </a:solidFill>
-                          <a:ln>
-                            <a:noFill/>
-                          </a:ln>
-                        </wps:spPr>
-                        <wps:style>
-                          <a:lnRef idx="2">
-                            <a:schemeClr val="accent1"/>
-                          </a:lnRef>
-                          <a:fillRef idx="1">
-                            <a:schemeClr val="lt1"/>
-                          </a:fillRef>
-                          <a:effectRef idx="0">
-                            <a:schemeClr val="accent1"/>
-                          </a:effectRef>
-                          <a:fontRef idx="minor">
-                            <a:schemeClr val="dk1"/>
-                          </a:fontRef>
-                        </wps:style>
-                        <wps:bodyPr rot="0" spcFirstLastPara="0" vertOverflow="overflow" horzOverflow="overflow" vert="horz" wrap="square" lIns="91440" tIns="45720" rIns="91440" bIns="45720" numCol="1" spcCol="0" rtlCol="0" fromWordArt="0" anchor="ctr" anchorCtr="0" forceAA="0" compatLnSpc="1">
-                          <a:prstTxWarp prst="textNoShape">
-                            <a:avLst/>
-                          </a:prstTxWarp>
-                          <a:noAutofit/>
-                        </wps:bodyPr>
-                      </wps:wsp>
-                      <wps:wsp>
-                        <wps:cNvPr id="60" name="Rectangle 60"/>
-                        <wps:cNvSpPr/>
-                        <wps:spPr>
-                          <a:xfrm>
-                            <a:off x="0" y="171450"/>
-                            <a:ext cx="7762875" cy="298687"/>
-                          </a:xfrm>
-                          <a:prstGeom prst="rect">
-                            <a:avLst/>
-                          </a:prstGeom>
-                          <a:solidFill>
-                            <a:srgbClr val="1649FF"/>
-                          </a:solidFill>
-                        </wps:spPr>
-                        <wps:style>
-                          <a:lnRef idx="1">
-                            <a:schemeClr val="accent1"/>
-                          </a:lnRef>
-                          <a:fillRef idx="3">
-                            <a:schemeClr val="accent1"/>
-                          </a:fillRef>
-                          <a:effectRef idx="2">
-                            <a:schemeClr val="accent1"/>
-                          </a:effectRef>
-                          <a:fontRef idx="minor">
-                            <a:schemeClr val="lt1"/>
-                          </a:fontRef>
-                        </wps:style>
-                        <wps:bodyPr rot="0" spcFirstLastPara="0" vertOverflow="overflow" horzOverflow="overflow" vert="horz" wrap="square" lIns="91440" tIns="45720" rIns="91440" bIns="45720" numCol="1" spcCol="0" rtlCol="0" fromWordArt="0" anchor="ctr" anchorCtr="0" forceAA="0" compatLnSpc="1">
-                          <a:prstTxWarp prst="textNoShape">
-                            <a:avLst/>
-                          </a:prstTxWarp>
-                          <a:noAutofit/>
-                        </wps:bodyPr>
-                      </wps:wsp>
-                    </wpg:wgp>
-                  </a:graphicData>
-                </a:graphic>
-                <wp14:sizeRelH relativeFrom="margin">
-                  <wp14:pctWidth>0</wp14:pctWidth>
-                </wp14:sizeRelH>
-                <wp14:sizeRelV relativeFrom="margin">
-                  <wp14:pctHeight>0</wp14:pctHeight>
-                </wp14:sizeRelV>
-              </wp:anchor>
-            </w:drawing>
-          </mc:Choice>
-          <mc:Fallback>
-            <w:pict>
-              <v:group w14:anchorId="6A1FF971" id="Group 58" o:spid="_x0000_s1026" style="position:absolute;margin-left:-98.05pt;margin-top:733.1pt;width:635.25pt;height:37.1pt;z-index:-251639808;mso-position-vertical-relative:page;mso-width-relative:margin;mso-height-relative:margin" coordorigin="-571" coordsize="78390,4701" o:gfxdata="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">
-                <v:rect id="Rectangle 59" o:spid="_x0000_s1027" style="position:absolute;left:-571;width:78390;height:2986;visibility:visible;mso-wrap-style:square;v-text-anchor:middle" o:gfxdata="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" fillcolor="#d8d8d8 [2732]" stroked="f" strokeweight="2pt"/>
-                <v:rect id="Rectangle 60" o:spid="_x0000_s1028" style="position:absolute;top:1714;width:77628;height:2987;visibility:visible;mso-wrap-style:square;v-text-anchor:middle" o:gfxdata="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" fillcolor="#1649ff" strokecolor="#4579b8 [3044]">
-                  <v:shadow on="t" color="black" opacity="22937f" origin=",.5" offset="0,.63889mm"/>
-                </v:rect>
-                <w10:wrap anchory="page"/>
-              </v:group>
-            </w:pict>
-          </mc:Fallback>
-        </mc:AlternateContent>
+        <w:pict w14:anchorId="108BDF79">
+          <v:group id="Group 58" o:spid="_x0000_s2050" style="position:absolute;margin-left:-98.05pt;margin-top:752.9pt;width:635.25pt;height:37.1pt;z-index:-251639808;mso-position-vertical-relative:page;mso-width-relative:margin;mso-height-relative:margin" coordorigin="-571" coordsize="78390,4701" o:gfxdata="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">
+            <v:rect id="Rectangle 59" o:spid="_x0000_s2051" style="position:absolute;left:-571;width:78390;height:2986;visibility:visible;mso-wrap-style:square;v-text-anchor:middle" o:gfxdata="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" fillcolor="#d8d8d8 [2732]" stroked="f" strokeweight="2pt"/>
+            <v:rect id="Rectangle 60" o:spid="_x0000_s2052" style="position:absolute;top:1714;width:77628;height:2987;visibility:visible;mso-wrap-style:square;v-text-anchor:middle" o:gfxdata="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" fillcolor="#1649ff" strokecolor="#4579b8 [3044]">
+              <v:shadow on="t" color="black" opacity="22937f" origin=",.5" offset="0,.63889mm"/>
+            </v:rect>
+            <w10:wrap anchory="page"/>
+          </v:group>
+        </w:pict>
       </w:r>
     </w:p>
     <w:sectPr>
@@ -4390,14 +4043,14 @@
         <v:path o:extrusionok="f" gradientshapeok="t" o:connecttype="rect"/>
         <o:lock v:ext="edit" aspectratio="t"/>
       </v:shapetype>
-      <v:shape id="_x0000_i1050" type="#_x0000_t75" style="width:18pt;height:18pt;visibility:visible;mso-wrap-style:square" o:bullet="t">
+      <v:shape id="_x0000_i1064" type="#_x0000_t75" style="width:18.35pt;height:18.35pt;visibility:visible" o:bullet="t">
         <v:imagedata r:id="rId1" o:title=""/>
       </v:shape>
     </w:pict>
   </w:numPicBullet>
   <w:numPicBullet w:numPicBulletId="1">
     <w:pict>
-      <v:shape id="_x0000_i1051" type="#_x0000_t75" style="width:18pt;height:18pt;visibility:visible;mso-wrap-style:square" o:bullet="t">
+      <v:shape id="_x0000_i1065" type="#_x0000_t75" style="width:18.35pt;height:18.35pt;visibility:visible" o:bullet="t">
         <v:imagedata r:id="rId2" o:title=""/>
       </v:shape>
     </w:pict>

</xml_diff>